<commit_message>
Spring 2026 data dump
</commit_message>
<xml_diff>
--- a/Documentation/MEPS/Supplemental Material.docx
+++ b/Documentation/MEPS/Supplemental Material.docx
@@ -4,6 +4,20 @@
   <w:body>
     <w:p>
       <w:pPr>
+        <w:pStyle w:val="Heading2"/>
+        <w:rPr>
+          <w:rStyle w:val="IntenseEmphasis"/>
+        </w:rPr>
+      </w:pPr>
+      <w:r>
+        <w:rPr>
+          <w:rStyle w:val="IntenseEmphasis"/>
+        </w:rPr>
+        <w:t>Supplemental Material</w:t>
+      </w:r>
+    </w:p>
+    <w:p>
+      <w:pPr>
         <w:rPr>
           <w:rStyle w:val="IntenseEmphasis"/>
         </w:rPr>
@@ -379,7 +393,14 @@
         <w:rPr>
           <w:bCs/>
         </w:rPr>
-        <w:t xml:space="preserve">. The size range of herring caught in our beach seines indicates they were mostly age-0 fish spawned the previous fall (mean 64 mm, SD 13 mm). Silverside spawn in the spring, with juveniles reaching 90-100 mm before growth ceases in the late fall </w:t>
+        <w:t xml:space="preserve">. The size range of herring caught in our beach seines indicates they were mostly age-0 fish spawned the </w:t>
+      </w:r>
+      <w:r>
+        <w:rPr>
+          <w:bCs/>
+        </w:rPr>
+        <w:lastRenderedPageBreak/>
+        <w:t xml:space="preserve">previous fall (mean 64 mm, SD 13 mm). Silverside spawn in the spring, with juveniles reaching 90-100 mm before growth ceases in the late fall </w:t>
       </w:r>
       <w:r>
         <w:rPr>
@@ -415,14 +436,7 @@
         <w:rPr>
           <w:bCs/>
         </w:rPr>
-        <w:t xml:space="preserve">. Silverside weekly average lengths were consistently around 100 mm in the first third of the sampling season but rapidly </w:t>
-      </w:r>
-      <w:r>
-        <w:rPr>
-          <w:bCs/>
-        </w:rPr>
-        <w:lastRenderedPageBreak/>
-        <w:t xml:space="preserve">decreased to a low of 67 mm in week 31. This indicates that mostly age-1+ silversides were caught early in the season, but recently-spawned silversides recruit to the seine and dominate catch by late July. This is consistent with phenological patterns and growth rates reported in the literature </w:t>
+        <w:t xml:space="preserve">. Silverside weekly average lengths were consistently around 100 mm in the first third of the sampling season but rapidly decreased to a low of 67 mm in week 31. This indicates that mostly age-1+ silversides were caught early in the season, but recently-spawned silversides recruit to the seine and dominate catch by late July. This is consistent with phenological patterns and growth rates reported in the literature </w:t>
       </w:r>
       <w:r>
         <w:rPr>
@@ -486,7 +500,7 @@
           <w:szCs w:val="22"/>
         </w:rPr>
         <w:drawing>
-          <wp:inline distT="0" distB="0" distL="0" distR="0" wp14:anchorId="4C027FB7" wp14:editId="16EA644D">
+          <wp:inline distT="0" distB="0" distL="0" distR="0" wp14:anchorId="4C027FB7" wp14:editId="7BCD3095">
             <wp:extent cx="3543300" cy="5295949"/>
             <wp:effectExtent l="0" t="0" r="0" b="0"/>
             <wp:docPr id="1890930710" name="Picture 4" descr="A graph of different sizes and lengths&#10;&#10;AI-generated content may be incorrect."/>
@@ -539,50 +553,137 @@
       <w:pPr>
         <w:spacing w:after="0" w:line="240" w:lineRule="auto"/>
         <w:rPr>
+          <w:bCs/>
+        </w:rPr>
+      </w:pPr>
+      <w:r>
+        <w:rPr>
+          <w:bCs/>
+        </w:rPr>
+        <w:t xml:space="preserve">Figure </w:t>
+      </w:r>
+      <w:r>
+        <w:rPr>
+          <w:bCs/>
+        </w:rPr>
+        <w:t>S1</w:t>
+      </w:r>
+      <w:r>
+        <w:rPr>
+          <w:bCs/>
+        </w:rPr>
+        <w:t xml:space="preserve">: Weekly length distributions (in mm) for herring (top panel) and silverside (bottom panel) aggregated across all sampled years. Blue lines indicate locally estimated scatterplot smoothing </w:t>
+      </w:r>
+      <w:r>
+        <w:rPr>
+          <w:bCs/>
+        </w:rPr>
+        <w:t xml:space="preserve">(LOESS) </w:t>
+      </w:r>
+      <w:r>
+        <w:rPr>
+          <w:bCs/>
+        </w:rPr>
+        <w:t xml:space="preserve">regressions to illustrate changes </w:t>
+      </w:r>
+      <w:r>
+        <w:rPr>
+          <w:bCs/>
+        </w:rPr>
+        <w:t xml:space="preserve">in </w:t>
+      </w:r>
+      <w:r>
+        <w:rPr>
+          <w:bCs/>
+        </w:rPr>
+        <w:t>average weekly lengths.</w:t>
+      </w:r>
+    </w:p>
+    <w:p>
+      <w:pPr>
+        <w:spacing w:after="0" w:line="240" w:lineRule="auto"/>
+        <w:rPr>
+          <w:bCs/>
+        </w:rPr>
+      </w:pPr>
+    </w:p>
+    <w:p>
+      <w:pPr>
+        <w:pStyle w:val="NormalWeb"/>
+      </w:pPr>
+      <w:r>
+        <w:rPr>
+          <w:noProof/>
+        </w:rPr>
+        <w:lastRenderedPageBreak/>
+        <w:drawing>
+          <wp:inline distT="0" distB="0" distL="0" distR="0" wp14:anchorId="2AB75E03" wp14:editId="579E59D4">
+            <wp:extent cx="5943600" cy="2970530"/>
+            <wp:effectExtent l="0" t="0" r="0" b="1270"/>
+            <wp:docPr id="1290405415" name="Picture 5" descr="A graph with numbers and lines&#10;&#10;AI-generated content may be incorrect."/>
+            <wp:cNvGraphicFramePr>
+              <a:graphicFrameLocks xmlns:a="http://schemas.openxmlformats.org/drawingml/2006/main" noChangeAspect="1"/>
+            </wp:cNvGraphicFramePr>
+            <a:graphic xmlns:a="http://schemas.openxmlformats.org/drawingml/2006/main">
+              <a:graphicData uri="http://schemas.openxmlformats.org/drawingml/2006/picture">
+                <pic:pic xmlns:pic="http://schemas.openxmlformats.org/drawingml/2006/picture">
+                  <pic:nvPicPr>
+                    <pic:cNvPr id="1290405415" name="Picture 5" descr="A graph with numbers and lines&#10;&#10;AI-generated content may be incorrect."/>
+                    <pic:cNvPicPr>
+                      <a:picLocks noChangeAspect="1" noChangeArrowheads="1"/>
+                    </pic:cNvPicPr>
+                  </pic:nvPicPr>
+                  <pic:blipFill>
+                    <a:blip r:embed="rId5" cstate="print">
+                      <a:extLst>
+                        <a:ext uri="{28A0092B-C50C-407E-A947-70E740481C1C}">
+                          <a14:useLocalDpi xmlns:a14="http://schemas.microsoft.com/office/drawing/2010/main" val="0"/>
+                        </a:ext>
+                      </a:extLst>
+                    </a:blip>
+                    <a:srcRect/>
+                    <a:stretch>
+                      <a:fillRect/>
+                    </a:stretch>
+                  </pic:blipFill>
+                  <pic:spPr bwMode="auto">
+                    <a:xfrm>
+                      <a:off x="0" y="0"/>
+                      <a:ext cx="5943600" cy="2970530"/>
+                    </a:xfrm>
+                    <a:prstGeom prst="rect">
+                      <a:avLst/>
+                    </a:prstGeom>
+                    <a:noFill/>
+                    <a:ln>
+                      <a:noFill/>
+                    </a:ln>
+                  </pic:spPr>
+                </pic:pic>
+              </a:graphicData>
+            </a:graphic>
+          </wp:inline>
+        </w:drawing>
+      </w:r>
+    </w:p>
+    <w:p>
+      <w:pPr>
+        <w:spacing w:after="0" w:line="240" w:lineRule="auto"/>
+        <w:rPr>
           <w:rStyle w:val="IntenseEmphasis"/>
         </w:rPr>
       </w:pPr>
       <w:r>
-        <w:rPr>
-          <w:bCs/>
-        </w:rPr>
         <w:t xml:space="preserve">Figure </w:t>
       </w:r>
       <w:r>
-        <w:rPr>
-          <w:bCs/>
-        </w:rPr>
-        <w:t>S1</w:t>
-      </w:r>
-      <w:r>
-        <w:rPr>
-          <w:bCs/>
-        </w:rPr>
-        <w:t xml:space="preserve">: Weekly length distributions (in mm) for herring (top panel) and silverside (bottom panel) aggregated across all sampled years. Blue lines indicate locally estimated scatterplot smoothing </w:t>
-      </w:r>
-      <w:r>
-        <w:rPr>
-          <w:bCs/>
-        </w:rPr>
-        <w:t xml:space="preserve">(LOESS) </w:t>
-      </w:r>
-      <w:r>
-        <w:rPr>
-          <w:bCs/>
-        </w:rPr>
-        <w:t xml:space="preserve">regressions to illustrate changes </w:t>
-      </w:r>
-      <w:r>
-        <w:rPr>
-          <w:bCs/>
-        </w:rPr>
-        <w:t xml:space="preserve">in </w:t>
-      </w:r>
-      <w:r>
-        <w:rPr>
-          <w:bCs/>
-        </w:rPr>
-        <w:t>average weekly lengths.</w:t>
+        <w:t>S2</w:t>
+      </w:r>
+      <w:r>
+        <w:t xml:space="preserve">: </w:t>
+      </w:r>
+      <w:r>
+        <w:t>Daily temperature anomalies (gray dots) observed at the Portland Harbor Tide Gauge during the 2014-2024 study period. Daily anomalies are the difference between the mean daily temperature and the expected daily temperature as calculated from the 2003-2020 climate reference period (CRP). Average annual anomaly values are indicated as red dots (anomalously warm) or blue dots (anomalously cool).</w:t>
       </w:r>
       <w:r>
         <w:rPr>
@@ -1207,7 +1308,6 @@
     <w:next w:val="Normal"/>
     <w:link w:val="Heading2Char"/>
     <w:uiPriority w:val="9"/>
-    <w:semiHidden/>
     <w:unhideWhenUsed/>
     <w:qFormat/>
     <w:rsid w:val="00AA53E9"/>
@@ -1424,7 +1524,6 @@
     <w:basedOn w:val="DefaultParagraphFont"/>
     <w:link w:val="Heading2"/>
     <w:uiPriority w:val="9"/>
-    <w:semiHidden/>
     <w:rsid w:val="00AA53E9"/>
     <w:rPr>
       <w:rFonts w:asciiTheme="majorHAnsi" w:eastAsiaTheme="majorEastAsia" w:hAnsiTheme="majorHAnsi" w:cstheme="majorBidi"/>

</xml_diff>